<commit_message>
update instructions for registering course PSRepository and publishing a module
</commit_message>
<xml_diff>
--- a/CYBER360-Ex-9.1-Modules.docx
+++ b/CYBER360-Ex-9.1-Modules.docx
@@ -46,8 +46,6 @@
           <w:r>
             <w:rPr>
               <w:rStyle w:val="PlaceholderText"/>
-              <w:sz w:val="22"/>
-              <w:szCs w:val="22"/>
             </w:rPr>
             <w:t>Click here to enter name</w:t>
           </w:r>
@@ -503,7 +501,6 @@
         </w:rPr>
         <w:br/>
       </w:r>
-      <w:proofErr w:type="gramStart"/>
       <w:r>
         <w:rPr>
           <w:i/>
@@ -520,17 +517,7 @@
           <w:sz w:val="22"/>
           <w:szCs w:val="22"/>
         </w:rPr>
-        <w:t>y the way, did</w:t>
-      </w:r>
-      <w:proofErr w:type="gramEnd"/>
-      <w:r>
-        <w:rPr>
-          <w:i/>
-          <w:iCs/>
-          <w:sz w:val="22"/>
-          <w:szCs w:val="22"/>
-        </w:rPr>
-        <w:t xml:space="preserve"> you know PowerShell </w:t>
+        <w:t xml:space="preserve">y the way, did you know PowerShell </w:t>
       </w:r>
       <w:r>
         <w:rPr>
@@ -825,23 +812,7 @@
           <w:sz w:val="22"/>
           <w:szCs w:val="22"/>
         </w:rPr>
-        <w:t xml:space="preserve">one of a </w:t>
-      </w:r>
-      <w:proofErr w:type="gramStart"/>
-      <w:r>
-        <w:rPr>
-          <w:sz w:val="22"/>
-          <w:szCs w:val="22"/>
-        </w:rPr>
-        <w:t>modules</w:t>
-      </w:r>
-      <w:proofErr w:type="gramEnd"/>
-      <w:r>
-        <w:rPr>
-          <w:sz w:val="22"/>
-          <w:szCs w:val="22"/>
-        </w:rPr>
-        <w:t xml:space="preserve"> exported commands:</w:t>
+        <w:t>one of a modules exported commands:</w:t>
       </w:r>
       <w:r>
         <w:rPr>
@@ -1403,25 +1374,7 @@
           <w:sz w:val="22"/>
           <w:szCs w:val="22"/>
         </w:rPr>
-        <w:t>$</w:t>
-      </w:r>
-      <w:proofErr w:type="gramStart"/>
-      <w:r>
-        <w:rPr>
-          <w:rStyle w:val="CommandChar"/>
-          <w:sz w:val="22"/>
-          <w:szCs w:val="22"/>
-        </w:rPr>
-        <w:t>env:PSModulePath</w:t>
-      </w:r>
-      <w:proofErr w:type="gramEnd"/>
-      <w:r>
-        <w:rPr>
-          <w:rStyle w:val="CommandChar"/>
-          <w:sz w:val="22"/>
-          <w:szCs w:val="22"/>
-        </w:rPr>
-        <w:t xml:space="preserve"> -split ';'</w:t>
+        <w:t>$env:PSModulePath -split ';'</w:t>
       </w:r>
       <w:r>
         <w:rPr>
@@ -1717,15 +1670,7 @@
           <w:sz w:val="22"/>
           <w:szCs w:val="22"/>
         </w:rPr>
-        <w:t xml:space="preserve">You can set it </w:t>
-      </w:r>
-      <w:proofErr w:type="gramStart"/>
-      <w:r>
-        <w:rPr>
-          <w:sz w:val="22"/>
-          <w:szCs w:val="22"/>
-        </w:rPr>
-        <w:t xml:space="preserve">from </w:t>
+        <w:t xml:space="preserve">You can set it from </w:t>
       </w:r>
       <w:r>
         <w:rPr>
@@ -1739,15 +1684,7 @@
           <w:sz w:val="22"/>
           <w:szCs w:val="22"/>
         </w:rPr>
-        <w:t>ontrol</w:t>
-      </w:r>
-      <w:proofErr w:type="gramEnd"/>
-      <w:r>
-        <w:rPr>
-          <w:sz w:val="22"/>
-          <w:szCs w:val="22"/>
-        </w:rPr>
-        <w:t xml:space="preserve"> </w:t>
+        <w:t xml:space="preserve">ontrol </w:t>
       </w:r>
       <w:r>
         <w:rPr>
@@ -2023,21 +1960,12 @@
           <w:szCs w:val="22"/>
         </w:rPr>
       </w:pPr>
-      <w:proofErr w:type="gramStart"/>
-      <w:r>
-        <w:rPr>
-          <w:sz w:val="22"/>
-          <w:szCs w:val="22"/>
-        </w:rPr>
-        <w:t>Or,</w:t>
-      </w:r>
-      <w:proofErr w:type="gramEnd"/>
-      <w:r>
-        <w:rPr>
-          <w:sz w:val="22"/>
-          <w:szCs w:val="22"/>
-        </w:rPr>
-        <w:t xml:space="preserve"> use</w:t>
+      <w:r>
+        <w:rPr>
+          <w:sz w:val="22"/>
+          <w:szCs w:val="22"/>
+        </w:rPr>
+        <w:t>Or, use</w:t>
       </w:r>
       <w:r>
         <w:rPr>
@@ -2177,22 +2105,13 @@
           <w:szCs w:val="22"/>
         </w:rPr>
       </w:pPr>
-      <w:proofErr w:type="gramStart"/>
       <w:r>
         <w:rPr>
           <w:sz w:val="22"/>
           <w:szCs w:val="22"/>
         </w:rPr>
         <w:lastRenderedPageBreak/>
-        <w:t>Or,</w:t>
-      </w:r>
-      <w:proofErr w:type="gramEnd"/>
-      <w:r>
-        <w:rPr>
-          <w:sz w:val="22"/>
-          <w:szCs w:val="22"/>
-        </w:rPr>
-        <w:t xml:space="preserve"> m</w:t>
+        <w:t>Or, m</w:t>
       </w:r>
       <w:r>
         <w:rPr>
@@ -2292,19 +2211,8 @@
           <w:sz w:val="22"/>
           <w:szCs w:val="22"/>
         </w:rPr>
-        <w:t>$</w:t>
-      </w:r>
-      <w:proofErr w:type="gramStart"/>
-      <w:r>
-        <w:rPr>
-          <w:b/>
-          <w:bCs/>
-          <w:sz w:val="22"/>
-          <w:szCs w:val="22"/>
-        </w:rPr>
-        <w:t>env:PSModulePath</w:t>
-      </w:r>
-      <w:proofErr w:type="gramEnd"/>
+        <w:t>$env:PSModulePath</w:t>
+      </w:r>
       <w:r>
         <w:rPr>
           <w:sz w:val="22"/>
@@ -2373,23 +2281,7 @@
           <w:sz w:val="22"/>
           <w:szCs w:val="22"/>
         </w:rPr>
-        <w:t xml:space="preserve">ffect </w:t>
-      </w:r>
-      <w:proofErr w:type="gramStart"/>
-      <w:r>
-        <w:rPr>
-          <w:sz w:val="22"/>
-          <w:szCs w:val="22"/>
-        </w:rPr>
-        <w:t>current</w:t>
-      </w:r>
-      <w:proofErr w:type="gramEnd"/>
-      <w:r>
-        <w:rPr>
-          <w:sz w:val="22"/>
-          <w:szCs w:val="22"/>
-        </w:rPr>
-        <w:t xml:space="preserve"> session</w:t>
+        <w:t>ffect current session</w:t>
       </w:r>
       <w:r>
         <w:rPr>
@@ -2496,15 +2388,7 @@
           <w:sz w:val="22"/>
           <w:szCs w:val="22"/>
         </w:rPr>
-        <w:t xml:space="preserve"> a login startup script, such </w:t>
-      </w:r>
-      <w:proofErr w:type="gramStart"/>
-      <w:r>
-        <w:rPr>
-          <w:sz w:val="22"/>
-          <w:szCs w:val="22"/>
-        </w:rPr>
-        <w:t>as</w:t>
+        <w:t xml:space="preserve"> a login startup script, such as</w:t>
       </w:r>
       <w:r>
         <w:rPr>
@@ -2522,7 +2406,6 @@
         </w:rPr>
         <w:t>.bashrc</w:t>
       </w:r>
-      <w:proofErr w:type="gramEnd"/>
       <w:r>
         <w:rPr>
           <w:sz w:val="22"/>
@@ -2614,21 +2497,12 @@
           <w:szCs w:val="22"/>
         </w:rPr>
       </w:pPr>
-      <w:proofErr w:type="gramStart"/>
-      <w:r>
-        <w:rPr>
-          <w:sz w:val="22"/>
-          <w:szCs w:val="22"/>
-        </w:rPr>
-        <w:t>Or,</w:t>
-      </w:r>
-      <w:proofErr w:type="gramEnd"/>
-      <w:r>
-        <w:rPr>
-          <w:sz w:val="22"/>
-          <w:szCs w:val="22"/>
-        </w:rPr>
-        <w:t xml:space="preserve"> u</w:t>
+      <w:r>
+        <w:rPr>
+          <w:sz w:val="22"/>
+          <w:szCs w:val="22"/>
+        </w:rPr>
+        <w:t>Or, u</w:t>
       </w:r>
       <w:r>
         <w:rPr>
@@ -2779,19 +2653,8 @@
           <w:sz w:val="22"/>
           <w:szCs w:val="22"/>
         </w:rPr>
-        <w:t>$</w:t>
-      </w:r>
-      <w:proofErr w:type="gramStart"/>
-      <w:r>
-        <w:rPr>
-          <w:b/>
-          <w:bCs/>
-          <w:sz w:val="22"/>
-          <w:szCs w:val="22"/>
-        </w:rPr>
-        <w:t>env:PSModulePath</w:t>
-      </w:r>
-      <w:proofErr w:type="gramEnd"/>
+        <w:t>$env:PSModulePath</w:t>
+      </w:r>
       <w:r>
         <w:rPr>
           <w:sz w:val="22"/>
@@ -3015,23 +2878,7 @@
           <w:sz w:val="22"/>
           <w:szCs w:val="22"/>
         </w:rPr>
-        <w:t xml:space="preserve">ome repositories (like PSGallery) also provide a </w:t>
-      </w:r>
-      <w:proofErr w:type="gramStart"/>
-      <w:r>
-        <w:rPr>
-          <w:sz w:val="22"/>
-          <w:szCs w:val="22"/>
-        </w:rPr>
-        <w:t>web based</w:t>
-      </w:r>
-      <w:proofErr w:type="gramEnd"/>
-      <w:r>
-        <w:rPr>
-          <w:sz w:val="22"/>
-          <w:szCs w:val="22"/>
-        </w:rPr>
-        <w:t xml:space="preserve"> search tool.</w:t>
+        <w:t>ome repositories (like PSGallery) also provide a web based search tool.</w:t>
       </w:r>
       <w:r>
         <w:rPr>
@@ -4697,20 +4544,8 @@
           <w:sz w:val="22"/>
           <w:szCs w:val="22"/>
         </w:rPr>
-        <w:t>Save-Module -Name id3 -</w:t>
-      </w:r>
-      <w:proofErr w:type="gramStart"/>
-      <w:r>
-        <w:rPr>
-          <w:rFonts w:ascii="Consolas" w:hAnsi="Consolas"/>
-          <w:b/>
-          <w:bCs/>
-          <w:sz w:val="22"/>
-          <w:szCs w:val="22"/>
-        </w:rPr>
-        <w:t>Path .</w:t>
-      </w:r>
-      <w:proofErr w:type="gramEnd"/>
+        <w:t>Save-Module -Name id3 -Path .</w:t>
+      </w:r>
       <w:r>
         <w:rPr>
           <w:sz w:val="22"/>
@@ -5045,7 +4880,6 @@
           <w:szCs w:val="22"/>
         </w:rPr>
       </w:pPr>
-      <w:proofErr w:type="gramStart"/>
       <w:r>
         <w:rPr>
           <w:rStyle w:val="AnswerChar"/>
@@ -5055,19 +4889,7 @@
           <w:sz w:val="22"/>
           <w:szCs w:val="22"/>
         </w:rPr>
-        <w:t>.psm</w:t>
-      </w:r>
-      <w:proofErr w:type="gramEnd"/>
-      <w:r>
-        <w:rPr>
-          <w:rStyle w:val="AnswerChar"/>
-          <w:b/>
-          <w:bCs/>
-          <w:color w:val="auto"/>
-          <w:sz w:val="22"/>
-          <w:szCs w:val="22"/>
-        </w:rPr>
-        <w:t>1</w:t>
+        <w:t>.psm1</w:t>
       </w:r>
       <w:r>
         <w:rPr>
@@ -5296,17 +5118,7 @@
           <w:sz w:val="22"/>
           <w:szCs w:val="22"/>
         </w:rPr>
-        <w:t xml:space="preserve">View the contents of </w:t>
-      </w:r>
-      <w:proofErr w:type="gramStart"/>
-      <w:r>
-        <w:rPr>
-          <w:rStyle w:val="AnswerChar"/>
-          <w:color w:val="auto"/>
-          <w:sz w:val="22"/>
-          <w:szCs w:val="22"/>
-        </w:rPr>
-        <w:t xml:space="preserve">the </w:t>
+        <w:t xml:space="preserve">View the contents of the </w:t>
       </w:r>
       <w:r>
         <w:rPr>
@@ -5317,19 +5129,7 @@
           <w:sz w:val="22"/>
           <w:szCs w:val="22"/>
         </w:rPr>
-        <w:t>.psm</w:t>
-      </w:r>
-      <w:proofErr w:type="gramEnd"/>
-      <w:r>
-        <w:rPr>
-          <w:rStyle w:val="AnswerChar"/>
-          <w:b/>
-          <w:bCs/>
-          <w:color w:val="auto"/>
-          <w:sz w:val="22"/>
-          <w:szCs w:val="22"/>
-        </w:rPr>
-        <w:t>1</w:t>
+        <w:t>.psm1</w:t>
       </w:r>
       <w:r>
         <w:rPr>
@@ -5464,18 +5264,8 @@
           <w:sz w:val="22"/>
           <w:szCs w:val="22"/>
         </w:rPr>
-        <w:t xml:space="preserve">Expand-Archive </w:t>
-      </w:r>
-      <w:proofErr w:type="gramStart"/>
-      <w:r>
-        <w:rPr>
-          <w:rStyle w:val="CommandChar"/>
-          <w:sz w:val="22"/>
-          <w:szCs w:val="22"/>
-        </w:rPr>
-        <w:t>.\crypto.zip .</w:t>
-      </w:r>
-      <w:proofErr w:type="gramEnd"/>
+        <w:t>Expand-Archive .\crypto.zip .</w:t>
+      </w:r>
       <w:r>
         <w:rPr>
           <w:rStyle w:val="CommandChar"/>
@@ -5849,7 +5639,6 @@
         </w:rPr>
         <w:t xml:space="preserve"> </w:t>
       </w:r>
-      <w:proofErr w:type="gramStart"/>
       <w:r>
         <w:rPr>
           <w:b/>
@@ -5857,9 +5646,15 @@
           <w:sz w:val="22"/>
           <w:szCs w:val="22"/>
         </w:rPr>
-        <w:t>crypto.psm</w:t>
-      </w:r>
-      <w:proofErr w:type="gramEnd"/>
+        <w:t>crypto.psm1</w:t>
+      </w:r>
+      <w:r>
+        <w:rPr>
+          <w:sz w:val="22"/>
+          <w:szCs w:val="22"/>
+        </w:rPr>
+        <w:t xml:space="preserve"> and </w:t>
+      </w:r>
       <w:r>
         <w:rPr>
           <w:b/>
@@ -5867,14 +5662,14 @@
           <w:sz w:val="22"/>
           <w:szCs w:val="22"/>
         </w:rPr>
-        <w:t>1</w:t>
-      </w:r>
-      <w:r>
-        <w:rPr>
-          <w:sz w:val="22"/>
-          <w:szCs w:val="22"/>
-        </w:rPr>
-        <w:t xml:space="preserve"> and </w:t>
+        <w:t>crypto.psd1</w:t>
+      </w:r>
+      <w:r>
+        <w:rPr>
+          <w:sz w:val="22"/>
+          <w:szCs w:val="22"/>
+        </w:rPr>
+        <w:t xml:space="preserve">. The </w:t>
       </w:r>
       <w:r>
         <w:rPr>
@@ -5883,14 +5678,84 @@
           <w:sz w:val="22"/>
           <w:szCs w:val="22"/>
         </w:rPr>
-        <w:t>crypto.psd1</w:t>
-      </w:r>
-      <w:r>
-        <w:rPr>
-          <w:sz w:val="22"/>
-          <w:szCs w:val="22"/>
-        </w:rPr>
-        <w:t xml:space="preserve">. The </w:t>
+        <w:t>.psd1</w:t>
+      </w:r>
+      <w:r>
+        <w:rPr>
+          <w:sz w:val="22"/>
+          <w:szCs w:val="22"/>
+        </w:rPr>
+        <w:t xml:space="preserve"> is the module manifest</w:t>
+      </w:r>
+      <w:r>
+        <w:rPr>
+          <w:sz w:val="22"/>
+          <w:szCs w:val="22"/>
+        </w:rPr>
+        <w:t xml:space="preserve">. </w:t>
+      </w:r>
+      <w:r>
+        <w:rPr>
+          <w:sz w:val="22"/>
+          <w:szCs w:val="22"/>
+        </w:rPr>
+        <w:t>(</w:t>
+      </w:r>
+      <w:r>
+        <w:rPr>
+          <w:sz w:val="22"/>
+          <w:szCs w:val="22"/>
+        </w:rPr>
+        <w:t>M</w:t>
+      </w:r>
+      <w:r>
+        <w:rPr>
+          <w:sz w:val="22"/>
+          <w:szCs w:val="22"/>
+        </w:rPr>
+        <w:t xml:space="preserve">ore on </w:t>
+      </w:r>
+      <w:r>
+        <w:rPr>
+          <w:sz w:val="22"/>
+          <w:szCs w:val="22"/>
+        </w:rPr>
+        <w:t>manifests</w:t>
+      </w:r>
+      <w:r>
+        <w:rPr>
+          <w:sz w:val="22"/>
+          <w:szCs w:val="22"/>
+        </w:rPr>
+        <w:t xml:space="preserve"> later</w:t>
+      </w:r>
+      <w:r>
+        <w:rPr>
+          <w:sz w:val="22"/>
+          <w:szCs w:val="22"/>
+        </w:rPr>
+        <w:t>.)</w:t>
+      </w:r>
+      <w:r>
+        <w:rPr>
+          <w:sz w:val="22"/>
+          <w:szCs w:val="22"/>
+        </w:rPr>
+        <w:t xml:space="preserve"> </w:t>
+      </w:r>
+      <w:r>
+        <w:rPr>
+          <w:sz w:val="22"/>
+          <w:szCs w:val="22"/>
+        </w:rPr>
+        <w:t>T</w:t>
+      </w:r>
+      <w:r>
+        <w:rPr>
+          <w:sz w:val="22"/>
+          <w:szCs w:val="22"/>
+        </w:rPr>
+        <w:t xml:space="preserve">he </w:t>
       </w:r>
       <w:r>
         <w:rPr>
@@ -5899,104 +5764,7 @@
           <w:sz w:val="22"/>
           <w:szCs w:val="22"/>
         </w:rPr>
-        <w:t>.psd1</w:t>
-      </w:r>
-      <w:r>
-        <w:rPr>
-          <w:sz w:val="22"/>
-          <w:szCs w:val="22"/>
-        </w:rPr>
-        <w:t xml:space="preserve"> is the module manifest</w:t>
-      </w:r>
-      <w:r>
-        <w:rPr>
-          <w:sz w:val="22"/>
-          <w:szCs w:val="22"/>
-        </w:rPr>
-        <w:t xml:space="preserve">. </w:t>
-      </w:r>
-      <w:r>
-        <w:rPr>
-          <w:sz w:val="22"/>
-          <w:szCs w:val="22"/>
-        </w:rPr>
-        <w:t>(</w:t>
-      </w:r>
-      <w:r>
-        <w:rPr>
-          <w:sz w:val="22"/>
-          <w:szCs w:val="22"/>
-        </w:rPr>
-        <w:t>M</w:t>
-      </w:r>
-      <w:r>
-        <w:rPr>
-          <w:sz w:val="22"/>
-          <w:szCs w:val="22"/>
-        </w:rPr>
-        <w:t xml:space="preserve">ore on </w:t>
-      </w:r>
-      <w:r>
-        <w:rPr>
-          <w:sz w:val="22"/>
-          <w:szCs w:val="22"/>
-        </w:rPr>
-        <w:t>manifests</w:t>
-      </w:r>
-      <w:r>
-        <w:rPr>
-          <w:sz w:val="22"/>
-          <w:szCs w:val="22"/>
-        </w:rPr>
-        <w:t xml:space="preserve"> later</w:t>
-      </w:r>
-      <w:r>
-        <w:rPr>
-          <w:sz w:val="22"/>
-          <w:szCs w:val="22"/>
-        </w:rPr>
-        <w:t>.)</w:t>
-      </w:r>
-      <w:r>
-        <w:rPr>
-          <w:sz w:val="22"/>
-          <w:szCs w:val="22"/>
-        </w:rPr>
-        <w:t xml:space="preserve"> </w:t>
-      </w:r>
-      <w:proofErr w:type="gramStart"/>
-      <w:r>
-        <w:rPr>
-          <w:sz w:val="22"/>
-          <w:szCs w:val="22"/>
-        </w:rPr>
-        <w:t>T</w:t>
-      </w:r>
-      <w:r>
-        <w:rPr>
-          <w:sz w:val="22"/>
-          <w:szCs w:val="22"/>
-        </w:rPr>
-        <w:t xml:space="preserve">he </w:t>
-      </w:r>
-      <w:r>
-        <w:rPr>
-          <w:b/>
-          <w:bCs/>
-          <w:sz w:val="22"/>
-          <w:szCs w:val="22"/>
-        </w:rPr>
-        <w:t>.psm</w:t>
-      </w:r>
-      <w:proofErr w:type="gramEnd"/>
-      <w:r>
-        <w:rPr>
-          <w:b/>
-          <w:bCs/>
-          <w:sz w:val="22"/>
-          <w:szCs w:val="22"/>
-        </w:rPr>
-        <w:t>1</w:t>
+        <w:t>.psm1</w:t>
       </w:r>
       <w:r>
         <w:rPr>
@@ -6217,23 +5985,7 @@
           <w:sz w:val="22"/>
           <w:szCs w:val="22"/>
         </w:rPr>
-        <w:t xml:space="preserve"> PowerShell naming conventions</w:t>
-      </w:r>
-      <w:proofErr w:type="gramStart"/>
-      <w:r>
-        <w:rPr>
-          <w:sz w:val="22"/>
-          <w:szCs w:val="22"/>
-        </w:rPr>
-        <w:t xml:space="preserve"> You</w:t>
-      </w:r>
-      <w:proofErr w:type="gramEnd"/>
-      <w:r>
-        <w:rPr>
-          <w:sz w:val="22"/>
-          <w:szCs w:val="22"/>
-        </w:rPr>
-        <w:t xml:space="preserve"> can override the warning by adding the </w:t>
+        <w:t xml:space="preserve"> PowerShell naming conventions You can override the warning by adding the </w:t>
       </w:r>
       <w:r>
         <w:rPr>
@@ -6494,23 +6246,7 @@
           <w:sz w:val="22"/>
           <w:szCs w:val="22"/>
         </w:rPr>
-        <w:t xml:space="preserve">What </w:t>
-      </w:r>
-      <w:proofErr w:type="gramStart"/>
-      <w:r>
-        <w:rPr>
-          <w:sz w:val="22"/>
-          <w:szCs w:val="22"/>
-        </w:rPr>
-        <w:t>is</w:t>
-      </w:r>
-      <w:proofErr w:type="gramEnd"/>
-      <w:r>
-        <w:rPr>
-          <w:sz w:val="22"/>
-          <w:szCs w:val="22"/>
-        </w:rPr>
-        <w:t xml:space="preserve"> the MD5 has of foo? </w:t>
+        <w:t xml:space="preserve">What is the MD5 has of foo? </w:t>
       </w:r>
       <w:sdt>
         <w:sdtPr>
@@ -6661,23 +6397,7 @@
           <w:sz w:val="22"/>
           <w:szCs w:val="22"/>
         </w:rPr>
-        <w:t xml:space="preserve">ry </w:t>
-      </w:r>
-      <w:proofErr w:type="gramStart"/>
-      <w:r>
-        <w:rPr>
-          <w:sz w:val="22"/>
-          <w:szCs w:val="22"/>
-        </w:rPr>
-        <w:t>running</w:t>
-      </w:r>
-      <w:proofErr w:type="gramEnd"/>
-      <w:r>
-        <w:rPr>
-          <w:sz w:val="22"/>
-          <w:szCs w:val="22"/>
-        </w:rPr>
-        <w:t xml:space="preserve"> getting a hash of </w:t>
+        <w:t xml:space="preserve">ry running getting a hash of </w:t>
       </w:r>
       <w:r>
         <w:rPr>
@@ -7041,15 +6761,7 @@
           <w:sz w:val="22"/>
           <w:szCs w:val="22"/>
         </w:rPr>
-        <w:t xml:space="preserve"> </w:t>
-      </w:r>
-      <w:proofErr w:type="gramStart"/>
-      <w:r>
-        <w:rPr>
-          <w:sz w:val="22"/>
-          <w:szCs w:val="22"/>
-        </w:rPr>
-        <w:t xml:space="preserve">use </w:t>
+        <w:t xml:space="preserve"> use </w:t>
       </w:r>
       <w:r>
         <w:rPr>
@@ -7061,7 +6773,6 @@
         </w:rPr>
         <w:t>:</w:t>
       </w:r>
-      <w:proofErr w:type="gramEnd"/>
       <w:r>
         <w:rPr>
           <w:sz w:val="22"/>
@@ -7113,25 +6824,7 @@
           <w:sz w:val="22"/>
           <w:szCs w:val="22"/>
         </w:rPr>
-        <w:t>$</w:t>
-      </w:r>
-      <w:proofErr w:type="gramStart"/>
-      <w:r>
-        <w:rPr>
-          <w:rStyle w:val="CommandChar"/>
-          <w:sz w:val="22"/>
-          <w:szCs w:val="22"/>
-        </w:rPr>
-        <w:t>env:PSModulePath</w:t>
-      </w:r>
-      <w:proofErr w:type="gramEnd"/>
-      <w:r>
-        <w:rPr>
-          <w:rStyle w:val="CommandChar"/>
-          <w:sz w:val="22"/>
-          <w:szCs w:val="22"/>
-        </w:rPr>
-        <w:t xml:space="preserve"> -split ';'</w:t>
+        <w:t>$env:PSModulePath -split ';'</w:t>
       </w:r>
       <w:r>
         <w:rPr>
@@ -7216,43 +6909,7 @@
           <w:sz w:val="22"/>
           <w:szCs w:val="22"/>
         </w:rPr>
-        <w:t>$</w:t>
-      </w:r>
-      <w:proofErr w:type="gramStart"/>
-      <w:r>
-        <w:rPr>
-          <w:rStyle w:val="CommandChar"/>
-          <w:sz w:val="22"/>
-          <w:szCs w:val="22"/>
-        </w:rPr>
-        <w:t>env:PSModulePath</w:t>
-      </w:r>
-      <w:proofErr w:type="gramEnd"/>
-      <w:r>
-        <w:rPr>
-          <w:rStyle w:val="CommandChar"/>
-          <w:sz w:val="22"/>
-          <w:szCs w:val="22"/>
-        </w:rPr>
-        <w:t xml:space="preserve"> -split ';'|? {$_ -like "$(Resolve-Path </w:t>
-      </w:r>
-      <w:proofErr w:type="gramStart"/>
-      <w:r>
-        <w:rPr>
-          <w:rStyle w:val="CommandChar"/>
-          <w:sz w:val="22"/>
-          <w:szCs w:val="22"/>
-        </w:rPr>
-        <w:t>~)*</w:t>
-      </w:r>
-      <w:proofErr w:type="gramEnd"/>
-      <w:r>
-        <w:rPr>
-          <w:rStyle w:val="CommandChar"/>
-          <w:sz w:val="22"/>
-          <w:szCs w:val="22"/>
-        </w:rPr>
-        <w:t>"}</w:t>
+        <w:t>$env:PSModulePath -split ';'|? {$_ -like "$(Resolve-Path ~)*"}</w:t>
       </w:r>
       <w:r>
         <w:rPr>
@@ -7443,43 +7100,7 @@
           <w:sz w:val="22"/>
           <w:szCs w:val="22"/>
         </w:rPr>
-        <w:t>$mp=$</w:t>
-      </w:r>
-      <w:proofErr w:type="gramStart"/>
-      <w:r>
-        <w:rPr>
-          <w:rStyle w:val="CommandChar"/>
-          <w:sz w:val="22"/>
-          <w:szCs w:val="22"/>
-        </w:rPr>
-        <w:t>env:PSModulePath</w:t>
-      </w:r>
-      <w:proofErr w:type="gramEnd"/>
-      <w:r>
-        <w:rPr>
-          <w:rStyle w:val="CommandChar"/>
-          <w:sz w:val="22"/>
-          <w:szCs w:val="22"/>
-        </w:rPr>
-        <w:t xml:space="preserve"> -split ';'|? {$_ -like "$(Resolve-Path </w:t>
-      </w:r>
-      <w:proofErr w:type="gramStart"/>
-      <w:r>
-        <w:rPr>
-          <w:rStyle w:val="CommandChar"/>
-          <w:sz w:val="22"/>
-          <w:szCs w:val="22"/>
-        </w:rPr>
-        <w:t>~)*</w:t>
-      </w:r>
-      <w:proofErr w:type="gramEnd"/>
-      <w:r>
-        <w:rPr>
-          <w:rStyle w:val="CommandChar"/>
-          <w:sz w:val="22"/>
-          <w:szCs w:val="22"/>
-        </w:rPr>
-        <w:t>"}</w:t>
+        <w:t>$mp=$env:PSModulePath -split ';'|? {$_ -like "$(Resolve-Path ~)*"}</w:t>
       </w:r>
     </w:p>
     <w:p>
@@ -7746,18 +7367,8 @@
           <w:sz w:val="22"/>
           <w:szCs w:val="22"/>
         </w:rPr>
-        <w:t xml:space="preserve">Get-MD5 </w:t>
-      </w:r>
-      <w:proofErr w:type="gramStart"/>
-      <w:r>
-        <w:rPr>
-          <w:rStyle w:val="CommandChar"/>
-          <w:sz w:val="22"/>
-          <w:szCs w:val="22"/>
-        </w:rPr>
-        <w:t>foo</w:t>
-      </w:r>
-      <w:proofErr w:type="gramEnd"/>
+        <w:t>Get-MD5 foo</w:t>
+      </w:r>
       <w:r>
         <w:rPr>
           <w:sz w:val="22"/>
@@ -7926,21 +7537,8 @@
           <w:sz w:val="22"/>
           <w:szCs w:val="22"/>
         </w:rPr>
-        <w:t xml:space="preserve">Get-MD5 </w:t>
-      </w:r>
-      <w:proofErr w:type="gramStart"/>
-      <w:r>
-        <w:rPr>
-          <w:rStyle w:val="AnswerChar"/>
-          <w:b/>
-          <w:bCs/>
-          <w:color w:val="auto"/>
-          <w:sz w:val="22"/>
-          <w:szCs w:val="22"/>
-        </w:rPr>
-        <w:t>foo</w:t>
-      </w:r>
-      <w:proofErr w:type="gramEnd"/>
+        <w:t>Get-MD5 foo</w:t>
+      </w:r>
       <w:r>
         <w:rPr>
           <w:rStyle w:val="AnswerChar"/>
@@ -8112,23 +7710,7 @@
           <w:sz w:val="22"/>
           <w:szCs w:val="22"/>
         </w:rPr>
-        <w:t xml:space="preserve"> you will register the repository so you can search, install, and </w:t>
-      </w:r>
-      <w:proofErr w:type="gramStart"/>
-      <w:r>
-        <w:rPr>
-          <w:sz w:val="22"/>
-          <w:szCs w:val="22"/>
-        </w:rPr>
-        <w:t>publish to</w:t>
-      </w:r>
-      <w:proofErr w:type="gramEnd"/>
-      <w:r>
-        <w:rPr>
-          <w:sz w:val="22"/>
-          <w:szCs w:val="22"/>
-        </w:rPr>
-        <w:t xml:space="preserve"> it. </w:t>
+        <w:t xml:space="preserve"> you will register the repository so you can search, install, and publish to it. </w:t>
       </w:r>
     </w:p>
     <w:p>
@@ -8207,7 +7789,7 @@
           <w:sz w:val="22"/>
           <w:szCs w:val="22"/>
         </w:rPr>
-        <w:t xml:space="preserve">Register-PSRepository -Name CIT361 </w:t>
+        <w:t xml:space="preserve">Register-PSRepository -Name cyber360 </w:t>
       </w:r>
       <w:r>
         <w:rPr>
@@ -8215,8 +7797,16 @@
           <w:sz w:val="22"/>
           <w:szCs w:val="22"/>
         </w:rPr>
+        <w:t>`</w:t>
+      </w:r>
+      <w:r>
+        <w:rPr>
+          <w:rStyle w:val="CommandChar"/>
+          <w:sz w:val="22"/>
+          <w:szCs w:val="22"/>
+        </w:rPr>
         <w:br/>
-        <w:t xml:space="preserve">  -SourceLocation http://cit361-lab.cit.byui.edu:8624/nuget/CIT361/ </w:t>
+        <w:t xml:space="preserve">  </w:t>
       </w:r>
       <w:r>
         <w:rPr>
@@ -8224,8 +7814,24 @@
           <w:sz w:val="22"/>
           <w:szCs w:val="22"/>
         </w:rPr>
+        <w:t xml:space="preserve">-SourceLocation http://360lab.cse.byui.edu:8624/nuget/cyber360/ </w:t>
+      </w:r>
+      <w:r>
+        <w:rPr>
+          <w:rStyle w:val="CommandChar"/>
+          <w:sz w:val="22"/>
+          <w:szCs w:val="22"/>
+        </w:rPr>
+        <w:t>`</w:t>
+      </w:r>
+      <w:r>
+        <w:rPr>
+          <w:rStyle w:val="CommandChar"/>
+          <w:sz w:val="22"/>
+          <w:szCs w:val="22"/>
+        </w:rPr>
         <w:br/>
-        <w:t xml:space="preserve">  -PublishLocation http://cit361-lab.cit.byui.edu:8624/nuget/CIT361/ </w:t>
+        <w:t xml:space="preserve">  </w:t>
       </w:r>
       <w:r>
         <w:rPr>
@@ -8233,8 +7839,32 @@
           <w:sz w:val="22"/>
           <w:szCs w:val="22"/>
         </w:rPr>
+        <w:t xml:space="preserve">-PublishLocation http://360lab.cse.byui.edu:8624/nuget/cyber360/ </w:t>
+      </w:r>
+      <w:r>
+        <w:rPr>
+          <w:rStyle w:val="CommandChar"/>
+          <w:sz w:val="22"/>
+          <w:szCs w:val="22"/>
+        </w:rPr>
+        <w:t>`</w:t>
+      </w:r>
+      <w:r>
+        <w:rPr>
+          <w:rStyle w:val="CommandChar"/>
+          <w:sz w:val="22"/>
+          <w:szCs w:val="22"/>
+        </w:rPr>
         <w:br/>
-        <w:t xml:space="preserve">  -InstallationPolicy Trusted</w:t>
+        <w:t xml:space="preserve">  </w:t>
+      </w:r>
+      <w:r>
+        <w:rPr>
+          <w:rStyle w:val="CommandChar"/>
+          <w:sz w:val="22"/>
+          <w:szCs w:val="22"/>
+        </w:rPr>
+        <w:t>-InstallationPolicy Trusted</w:t>
       </w:r>
       <w:r>
         <w:rPr>
@@ -8295,7 +7925,15 @@
           <w:sz w:val="22"/>
           <w:szCs w:val="22"/>
         </w:rPr>
-        <w:t>Find-Module -Repository cit361</w:t>
+        <w:t>Find-Module -Repository c</w:t>
+      </w:r>
+      <w:r>
+        <w:rPr>
+          <w:rStyle w:val="CommandChar"/>
+          <w:sz w:val="22"/>
+          <w:szCs w:val="22"/>
+        </w:rPr>
+        <w:t>yber360</w:t>
       </w:r>
       <w:r>
         <w:rPr>
@@ -8603,7 +8241,7 @@
         <w:sz w:val="16"/>
         <w:szCs w:val="18"/>
       </w:rPr>
-      <w:t>2025</w:t>
+      <w:t>2026</w:t>
     </w:r>
     <w:r>
       <w:rPr>
@@ -14896,6 +14534,7 @@
     <w:rsid w:val="002A5C42"/>
     <w:rsid w:val="002A7E0B"/>
     <w:rsid w:val="002D68FF"/>
+    <w:rsid w:val="002E0A81"/>
     <w:rsid w:val="00346A5C"/>
     <w:rsid w:val="0036402A"/>
     <w:rsid w:val="003D23CA"/>
@@ -14931,6 +14570,7 @@
     <w:rsid w:val="009C2BE2"/>
     <w:rsid w:val="00A13669"/>
     <w:rsid w:val="00A21396"/>
+    <w:rsid w:val="00A4473D"/>
     <w:rsid w:val="00A8380A"/>
     <w:rsid w:val="00AD1DF9"/>
     <w:rsid w:val="00B3043F"/>

</xml_diff>